<commit_message>
M5-03 Use recheckable quote fixture values
</commit_message>
<xml_diff>
--- a/backend/tests/fixtures/docx/coverage_quote_table.docx
+++ b/backend/tests/fixtures/docx/coverage_quote_table.docx
@@ -119,17 +119,17 @@
           </w:tcPr>
           <w:p>
             <w:r>
-              <w:t xml:space="preserve">USD 100.00</w:t>
-            </w:r>
-          </w:p>
-        </w:tc>
-        <w:tc>
-          <w:tcPr>
-            <w:tcW w:w="2000" w:type="dxa"/>
-          </w:tcPr>
-          <w:p>
-            <w:r>
-              <w:t xml:space="preserve">USD 1,000.00</w:t>
+              <w:t xml:space="preserve">USD 1,234.56</w:t>
+            </w:r>
+          </w:p>
+        </w:tc>
+        <w:tc>
+          <w:tcPr>
+            <w:tcW w:w="2000" w:type="dxa"/>
+          </w:tcPr>
+          <w:p>
+            <w:r>
+              <w:t xml:space="preserve">USD 12,345.60</w:t>
             </w:r>
           </w:p>
         </w:tc>
@@ -171,17 +171,17 @@
           </w:tcPr>
           <w:p>
             <w:r>
-              <w:t xml:space="preserve">USD 200.00</w:t>
-            </w:r>
-          </w:p>
-        </w:tc>
-        <w:tc>
-          <w:tcPr>
-            <w:tcW w:w="2000" w:type="dxa"/>
-          </w:tcPr>
-          <w:p>
-            <w:r>
-              <w:t xml:space="preserve">USD 4,000.00</w:t>
+              <w:t xml:space="preserve">USD 2,345.67</w:t>
+            </w:r>
+          </w:p>
+        </w:tc>
+        <w:tc>
+          <w:tcPr>
+            <w:tcW w:w="2000" w:type="dxa"/>
+          </w:tcPr>
+          <w:p>
+            <w:r>
+              <w:t xml:space="preserve">USD 46,913.40</w:t>
             </w:r>
           </w:p>
         </w:tc>
@@ -223,17 +223,17 @@
           </w:tcPr>
           <w:p>
             <w:r>
-              <w:t xml:space="preserve">USD 300.00</w:t>
-            </w:r>
-          </w:p>
-        </w:tc>
-        <w:tc>
-          <w:tcPr>
-            <w:tcW w:w="2000" w:type="dxa"/>
-          </w:tcPr>
-          <w:p>
-            <w:r>
-              <w:t xml:space="preserve">USD 9,000.00</w:t>
+              <w:t xml:space="preserve">USD 3,456.78</w:t>
+            </w:r>
+          </w:p>
+        </w:tc>
+        <w:tc>
+          <w:tcPr>
+            <w:tcW w:w="2000" w:type="dxa"/>
+          </w:tcPr>
+          <w:p>
+            <w:r>
+              <w:t xml:space="preserve">USD 103,703.40</w:t>
             </w:r>
           </w:p>
         </w:tc>

</xml_diff>